<commit_message>
feat: add English and Chinese interface
</commit_message>
<xml_diff>
--- a/docs/WEMOVE体育用品宣传网站项目验收讲解文档.docx
+++ b/docs/WEMOVE体育用品宣传网站项目验收讲解文档.docx
@@ -874,7 +874,7 @@
           <w:color w:val="18242B"/>
           <w:sz w:val="19"/>
         </w:rPr>
-        <w:t>目前交付的是第一阶段基础闭环。真实产品图片、规格与正式联系资料尚未提供，所以官网保留空目录和本地预览提示，没有编造商品。经销商申请、专属价格、报价、订单、支付、多语言和正式部署属于后续阶段。</w:t>
+        <w:t>目前交付的是第一阶段基础闭环。真实产品图片、规格与正式联系资料尚未提供，所以官网保留空目录和本地预览提示，没有编造商品。界面已支持英汉切换；经销商申请、专属价格、报价、订单、支付、独立语言内容和正式部署属于后续阶段。</w:t>
       </w:r>
     </w:p>
     <w:p>
@@ -5681,6 +5681,20 @@
           <w:color w:val="18242B"/>
           <w:sz w:val="19"/>
         </w:rPr>
+        <w:t>官网与主要后台界面支持 English／中文切换，语言偏好跨页面保留。</w:t>
+      </w:r>
+    </w:p>
+    <w:p>
+      <w:pPr>
+        <w:pStyle w:val="ListBullet"/>
+      </w:pPr>
+      <w:r>
+        <w:rPr>
+          <w:rFonts w:ascii="Aptos" w:hAnsi="Aptos" w:eastAsia="Microsoft YaHei"/>
+          <w:b w:val="0"/>
+          <w:color w:val="18242B"/>
+          <w:sz w:val="19"/>
+        </w:rPr>
         <w:t>后台商品、询盘、首页文案和审计界面。</w:t>
       </w:r>
     </w:p>
@@ -5746,7 +5760,7 @@
           <w:color w:val="18242B"/>
           <w:sz w:val="19"/>
         </w:rPr>
-        <w:t>下一阶段可按业务依赖加入经销商申请、补件与审核，再建立企业、成员、授权目录和私有资料。此后扩展报价、采购、订单、用户服务和 B2C，最后接入邮件、支付、多语言、监控、备份与部署。这样的顺序能够复用现有身份、商品、审计和数据库基础。</w:t>
+        <w:t>下一阶段可按业务依赖加入经销商申请、补件与审核，再建立企业、成员、授权目录和私有资料。此后扩展报价、采购、订单、用户服务和 B2C，最后接入邮件、支付、独立语言内容、监控、备份与部署。这样的顺序能够复用现有身份、商品、审计和数据库基础。</w:t>
       </w:r>
     </w:p>
     <w:p>
@@ -6121,7 +6135,7 @@
                 <w:color w:val="18242B"/>
                 <w:sz w:val="16"/>
               </w:rPr>
-              <w:t>完整需求有 198 个编号，本阶段有 44 项部分覆盖，没有把阶段成果称为全量完成。</w:t>
+              <w:t>完整需求有 198 个编号，本阶段有 47 项部分覆盖，没有把阶段成果称为全量完成。</w:t>
             </w:r>
           </w:p>
         </w:tc>

</xml_diff>

<commit_message>
feat: publish demo product catalog
</commit_message>
<xml_diff>
--- a/docs/WEMOVE体育用品宣传网站项目验收讲解文档.docx
+++ b/docs/WEMOVE体育用品宣传网站项目验收讲解文档.docx
@@ -874,7 +874,7 @@
           <w:color w:val="18242B"/>
           <w:sz w:val="19"/>
         </w:rPr>
-        <w:t>目前交付的是第一阶段基础闭环。真实产品图片、规格与正式联系资料尚未提供，所以官网保留空目录和本地预览提示，没有编造商品。界面已支持英汉切换；经销商申请、专属价格、报价、订单、支付、独立语言内容和正式部署属于后续阶段。</w:t>
+        <w:t>目前交付的是第一阶段基础闭环。官网已经上架 24 件演示商品，分为保龄球、平衡协调和户外游戏三类，每件都包含生成式商品图、图片描述、玩法、卖点、安全说明和规格。界面支持英汉切换；经销商申请、专属价格、报价、订单、支付、独立语言内容和正式部署属于后续阶段。</w:t>
       </w:r>
     </w:p>
     <w:p>
@@ -4328,7 +4328,7 @@
                 <w:color w:val="18242B"/>
                 <w:sz w:val="16"/>
               </w:rPr>
-              <w:t>数据库迁移重跑</w:t>
+              <w:t>商品目录</w:t>
             </w:r>
           </w:p>
         </w:tc>
@@ -4357,7 +4357,7 @@
                 <w:color w:val="18242B"/>
                 <w:sz w:val="16"/>
               </w:rPr>
-              <w:t>通过</w:t>
+              <w:t>24 件商品与 24 张主图可访问</w:t>
             </w:r>
           </w:p>
         </w:tc>
@@ -4386,7 +4386,7 @@
                 <w:color w:val="18242B"/>
                 <w:sz w:val="16"/>
               </w:rPr>
-              <w:t>已执行迁移不会重复应用</w:t>
+              <w:t>清单、媒体和分页已经接通</w:t>
             </w:r>
           </w:p>
         </w:tc>
@@ -5579,7 +5579,7 @@
           <w:color w:val="18242B"/>
           <w:sz w:val="19"/>
         </w:rPr>
-        <w:t>4.  准备一个明确标为演示的商品和一条演示咨询，避免混入真实信息。</w:t>
+        <w:t>4.  从 24 件演示商品中选择一件讲解，并准备一条演示咨询，避免混入真实信息。</w:t>
       </w:r>
     </w:p>
     <w:p>
@@ -5668,6 +5668,20 @@
           <w:sz w:val="19"/>
         </w:rPr>
         <w:t>响应式官网首页、产品目录、产品详情、联系、品牌介绍和本地隐私说明。</w:t>
+      </w:r>
+    </w:p>
+    <w:p>
+      <w:pPr>
+        <w:pStyle w:val="ListBullet"/>
+      </w:pPr>
+      <w:r>
+        <w:rPr>
+          <w:rFonts w:ascii="Aptos" w:hAnsi="Aptos" w:eastAsia="Microsoft YaHei"/>
+          <w:b w:val="0"/>
+          <w:color w:val="18242B"/>
+          <w:sz w:val="19"/>
+        </w:rPr>
+        <w:t>24 件演示商品及配套成品图、图片描述、卖点、玩法、安全说明和规格。</w:t>
       </w:r>
     </w:p>
     <w:p>
@@ -5871,7 +5885,7 @@
                 <w:color w:val="18242B"/>
                 <w:sz w:val="16"/>
               </w:rPr>
-              <w:t>为什么目录没有真实商品</w:t>
+              <w:t>这些商品资料从哪里来</w:t>
             </w:r>
           </w:p>
         </w:tc>
@@ -5899,7 +5913,7 @@
                 <w:color w:val="18242B"/>
                 <w:sz w:val="16"/>
               </w:rPr>
-              <w:t>真实素材尚未提供，为避免伪造，系统展示可解释的空状态；后台发布链路已经可以使用。</w:t>
+              <w:t>当前 24 件为课程演示目录，图片由生成式图像工具制作，并逐件补充描述、玩法和安全信息；正式上线前应由企业确认真实 SKU 和规格。</w:t>
             </w:r>
           </w:p>
         </w:tc>
@@ -6017,7 +6031,7 @@
                 <w:color w:val="18242B"/>
                 <w:sz w:val="16"/>
               </w:rPr>
-              <w:t>可在后台新增草稿、发布并在官网看到；咨询编号和状态都能在数据库重启后保留。</w:t>
+              <w:t>商品由幂等脚本写入 PostgreSQL，也可在后台新增、修改、归档；咨询编号和状态会在数据库重启后保留。</w:t>
             </w:r>
           </w:p>
         </w:tc>
@@ -6136,80 +6150,6 @@
                 <w:sz w:val="16"/>
               </w:rPr>
               <w:t>完整需求有 198 个编号，本阶段有 47 项部分覆盖，没有把阶段成果称为全量完成。</w:t>
-            </w:r>
-          </w:p>
-        </w:tc>
-      </w:tr>
-    </w:tbl>
-    <w:tbl>
-      <w:tblPr>
-        <w:tblW w:type="auto" w:w="0"/>
-        <w:jc w:val="center"/>
-        <w:tblLook w:firstColumn="1" w:firstRow="1" w:lastColumn="0" w:lastRow="0" w:noHBand="0" w:noVBand="1" w:val="04A0"/>
-      </w:tblPr>
-      <w:tblGrid>
-        <w:gridCol w:w="4986"/>
-        <w:gridCol w:w="4986"/>
-      </w:tblGrid>
-      <w:tr>
-        <w:trPr>
-          <w:tblHeader w:val="true"/>
-        </w:trPr>
-        <w:tc>
-          <w:tcPr>
-            <w:tcW w:type="dxa" w:w="4986"/>
-            <w:vAlign w:val="center"/>
-            <w:tcMar>
-              <w:top w:w="75" w:type="dxa"/>
-              <w:start w:w="120" w:type="dxa"/>
-              <w:bottom w:w="75" w:type="dxa"/>
-              <w:end w:w="120" w:type="dxa"/>
-            </w:tcMar>
-            <w:shd w:fill="2E7D72"/>
-          </w:tcPr>
-          <w:p>
-            <w:pPr>
-              <w:spacing w:after="0"/>
-              <w:jc w:val="center"/>
-            </w:pPr>
-            <w:r/>
-            <w:r>
-              <w:rPr>
-                <w:rFonts w:ascii="Aptos" w:hAnsi="Aptos" w:eastAsia="Microsoft YaHei"/>
-                <w:b/>
-                <w:color w:val="FFFFFF"/>
-                <w:sz w:val="17"/>
-              </w:rPr>
-              <w:t>收尾表述</w:t>
-            </w:r>
-          </w:p>
-        </w:tc>
-        <w:tc>
-          <w:tcPr>
-            <w:tcW w:type="dxa" w:w="4986"/>
-            <w:vAlign w:val="center"/>
-            <w:tcMar>
-              <w:top w:w="75" w:type="dxa"/>
-              <w:start w:w="120" w:type="dxa"/>
-              <w:bottom w:w="75" w:type="dxa"/>
-              <w:end w:w="120" w:type="dxa"/>
-            </w:tcMar>
-            <w:shd w:fill="E8F2EF"/>
-          </w:tcPr>
-          <w:p>
-            <w:pPr>
-              <w:spacing w:after="0"/>
-              <w:jc w:val="left"/>
-            </w:pPr>
-            <w:r/>
-            <w:r>
-              <w:rPr>
-                <w:rFonts w:ascii="Aptos" w:hAnsi="Aptos" w:eastAsia="Microsoft YaHei"/>
-                <w:b w:val="0"/>
-                <w:color w:val="18242B"/>
-                <w:sz w:val="18"/>
-              </w:rPr>
-              <w:t>“这次验收的重点是第一阶段闭环已经真实运行，并为下一阶段保留了清楚的数据和模块边界。未完成部分已经记录，没有用占位内容代替业务完成度。”</w:t>
             </w:r>
           </w:p>
         </w:tc>

</xml_diff>